<commit_message>
:books: docs: Atualizando documentação
</commit_message>
<xml_diff>
--- a/Documents/Documents/Sprint_08_Task097_DesenvolverApiProductBatch.docx
+++ b/Documents/Documents/Sprint_08_Task097_DesenvolverApiProductBatch.docx
@@ -350,7 +350,11 @@
             <w:tcW w:w="10201" w:type="dxa"/>
             <w:gridSpan w:val="3"/>
           </w:tcPr>
-          <w:p/>
+          <w:p>
+            <w:r>
+              <w:t>Marco Antônio Dos Santos Masson</w:t>
+            </w:r>
+          </w:p>
         </w:tc>
       </w:tr>
       <w:tr>
@@ -359,7 +363,11 @@
             <w:tcW w:w="10201" w:type="dxa"/>
             <w:gridSpan w:val="3"/>
           </w:tcPr>
-          <w:p/>
+          <w:p>
+            <w:r>
+              <w:t>Renato dos Santos Filho</w:t>
+            </w:r>
+          </w:p>
         </w:tc>
       </w:tr>
       <w:tr>
@@ -368,7 +376,11 @@
             <w:tcW w:w="10201" w:type="dxa"/>
             <w:gridSpan w:val="3"/>
           </w:tcPr>
-          <w:p/>
+          <w:p>
+            <w:r>
+              <w:t>Rodrigo Yoshida Lombezi</w:t>
+            </w:r>
+          </w:p>
         </w:tc>
       </w:tr>
       <w:tr>
@@ -377,7 +389,11 @@
             <w:tcW w:w="10201" w:type="dxa"/>
             <w:gridSpan w:val="3"/>
           </w:tcPr>
-          <w:p/>
+          <w:p>
+            <w:r>
+              <w:t>Franciane Ramos Franco</w:t>
+            </w:r>
+          </w:p>
         </w:tc>
       </w:tr>
       <w:tr>
@@ -386,7 +402,11 @@
             <w:tcW w:w="10201" w:type="dxa"/>
             <w:gridSpan w:val="3"/>
           </w:tcPr>
-          <w:p/>
+          <w:p>
+            <w:r>
+              <w:t>Vinicius Lúcio Marcolino da Silva</w:t>
+            </w:r>
+          </w:p>
         </w:tc>
       </w:tr>
     </w:tbl>
@@ -599,12 +619,12 @@
         <w:tblLook w:val="04A0" w:firstRow="1" w:lastRow="0" w:firstColumn="1" w:lastColumn="0" w:noHBand="0" w:noVBand="1"/>
       </w:tblPr>
       <w:tblGrid>
-        <w:gridCol w:w="818"/>
-        <w:gridCol w:w="2893"/>
-        <w:gridCol w:w="1618"/>
-        <w:gridCol w:w="1406"/>
-        <w:gridCol w:w="1807"/>
-        <w:gridCol w:w="1641"/>
+        <w:gridCol w:w="828"/>
+        <w:gridCol w:w="2971"/>
+        <w:gridCol w:w="1441"/>
+        <w:gridCol w:w="1418"/>
+        <w:gridCol w:w="1842"/>
+        <w:gridCol w:w="1683"/>
       </w:tblGrid>
       <w:tr>
         <w:tc>
@@ -720,7 +740,10 @@
           </w:tcPr>
           <w:p>
             <w:r>
-              <w:t>Marcoantonio-dev</w:t>
+              <w:t>M</w:t>
+            </w:r>
+            <w:r>
+              <w:t>arco Masson</w:t>
             </w:r>
           </w:p>
         </w:tc>
@@ -3017,6 +3040,7 @@
   <w:style w:type="character" w:default="1" w:styleId="DefaultParagraphFont">
     <w:name w:val="Default Paragraph Font"/>
     <w:uiPriority w:val="1"/>
+    <w:semiHidden/>
     <w:unhideWhenUsed/>
   </w:style>
   <w:style w:type="table" w:default="1" w:styleId="TableNormal">
@@ -3697,6 +3721,15 @@
 </file>
 
 <file path=customXml/item2.xml><?xml version="1.0" encoding="utf-8"?>
+<?mso-contentType ?>
+<FormTemplates xmlns="http://schemas.microsoft.com/sharepoint/v3/contenttype/forms">
+  <Display>DocumentLibraryForm</Display>
+  <Edit>DocumentLibraryForm</Edit>
+  <New>DocumentLibraryForm</New>
+</FormTemplates>
+</file>
+
+<file path=customXml/item3.xml><?xml version="1.0" encoding="utf-8"?>
 <ct:contentTypeSchema xmlns:ct="http://schemas.microsoft.com/office/2006/metadata/contentType" xmlns:ma="http://schemas.microsoft.com/office/2006/metadata/properties/metaAttributes" ct:_="" ma:_="" ma:contentTypeName="Documento" ma:contentTypeID="0x010100B37008164333CE47B7554A23BF4CE40A" ma:contentTypeVersion="3" ma:contentTypeDescription="Crie um novo documento." ma:contentTypeScope="" ma:versionID="01d70e1db2e5282cbeb036b3d8462683">
   <xsd:schema xmlns:xsd="http://www.w3.org/2001/XMLSchema" xmlns:xs="http://www.w3.org/2001/XMLSchema" xmlns:p="http://schemas.microsoft.com/office/2006/metadata/properties" xmlns:ns2="0dd540f2-19ea-4199-a9ce-e531162f98d7" targetNamespace="http://schemas.microsoft.com/office/2006/metadata/properties" ma:root="true" ma:fieldsID="b0ca1735cf6dfdacfbf35c674503d2b1" ns2:_="">
     <xsd:import namespace="0dd540f2-19ea-4199-a9ce-e531162f98d7"/>
@@ -3834,15 +3867,6 @@
 </ct:contentTypeSchema>
 </file>
 
-<file path=customXml/item3.xml><?xml version="1.0" encoding="utf-8"?>
-<?mso-contentType ?>
-<FormTemplates xmlns="http://schemas.microsoft.com/sharepoint/v3/contenttype/forms">
-  <Display>DocumentLibraryForm</Display>
-  <Edit>DocumentLibraryForm</Edit>
-  <New>DocumentLibraryForm</New>
-</FormTemplates>
-</file>
-
 <file path=customXml/itemProps1.xml><?xml version="1.0" encoding="utf-8"?>
 <ds:datastoreItem xmlns:ds="http://schemas.openxmlformats.org/officeDocument/2006/customXml" ds:itemID="{0028EFB7-3706-477C-BC22-76AF0C752638}">
   <ds:schemaRefs>
@@ -3853,6 +3877,14 @@
 </file>
 
 <file path=customXml/itemProps2.xml><?xml version="1.0" encoding="utf-8"?>
+<ds:datastoreItem xmlns:ds="http://schemas.openxmlformats.org/officeDocument/2006/customXml" ds:itemID="{0876BD9A-9CA5-48C2-BF8E-F2DECFB0FD38}">
+  <ds:schemaRefs>
+    <ds:schemaRef ds:uri="http://schemas.microsoft.com/sharepoint/v3/contenttype/forms"/>
+  </ds:schemaRefs>
+</ds:datastoreItem>
+</file>
+
+<file path=customXml/itemProps3.xml><?xml version="1.0" encoding="utf-8"?>
 <ds:datastoreItem xmlns:ds="http://schemas.openxmlformats.org/officeDocument/2006/customXml" ds:itemID="{3258D31E-C4C0-4BAE-8DEF-91B5992C0A3A}">
   <ds:schemaRefs>
     <ds:schemaRef ds:uri="http://schemas.microsoft.com/office/2006/metadata/contentType"/>
@@ -3868,12 +3900,4 @@
     <ds:schemaRef ds:uri="http://schemas.microsoft.com/internal/obd"/>
   </ds:schemaRefs>
 </ds:datastoreItem>
-</file>
-
-<file path=customXml/itemProps3.xml><?xml version="1.0" encoding="utf-8"?>
-<ds:datastoreItem xmlns:ds="http://schemas.openxmlformats.org/officeDocument/2006/customXml" ds:itemID="{0876BD9A-9CA5-48C2-BF8E-F2DECFB0FD38}">
-  <ds:schemaRefs>
-    <ds:schemaRef ds:uri="http://schemas.microsoft.com/sharepoint/v3/contenttype/forms"/>
-  </ds:schemaRefs>
-</ds:datastoreItem>
 </file>
</xml_diff>